<commit_message>
Add @clerk/ui dependency to package.json
</commit_message>
<xml_diff>
--- a/chargingstationsapp DEMO.docx
+++ b/chargingstationsapp DEMO.docx
@@ -70,6 +70,18 @@
       <w:r>
         <w:t xml:space="preserve">Tests + coverage + MD </w:t>
       </w:r>
+      <w:r>
+        <w:tab/>
+      </w:r>
+      <w:r>
+        <w:t>npm run test</w:t>
+      </w:r>
+      <w:r>
+        <w:t xml:space="preserve"> &amp; </w:t>
+      </w:r>
+      <w:r>
+        <w:t>npm run test:coverage</w:t>
+      </w:r>
     </w:p>
     <w:p>
       <w:pPr>
@@ -117,6 +129,21 @@
       </w:pPr>
       <w:r>
         <w:t>Clerk UI dark theme</w:t>
+      </w:r>
+    </w:p>
+    <w:p>
+      <w:pPr>
+        <w:pStyle w:val="ListParagraph"/>
+        <w:numPr>
+          <w:ilvl w:val="0"/>
+          <w:numId w:val="1"/>
+        </w:numPr>
+      </w:pPr>
+      <w:r>
+        <w:t>Mail functionality</w:t>
+      </w:r>
+      <w:r>
+        <w:t>, evt sms</w:t>
       </w:r>
     </w:p>
     <w:p>

</xml_diff>

<commit_message>
docs: update DEMO document with security recommendations and architectural insights
</commit_message>
<xml_diff>
--- a/chargingstationsapp DEMO.docx
+++ b/chargingstationsapp DEMO.docx
@@ -18,6 +18,11 @@
     <w:p>
       <w:r>
         <w:t>Charging stations app (greenfield app)</w:t>
+      </w:r>
+    </w:p>
+    <w:p>
+      <w:r>
+        <w:t>Iterative way (MD files)</w:t>
       </w:r>
     </w:p>
     <w:p>
@@ -56,7 +61,10 @@
         <w:t>Auditing</w:t>
       </w:r>
       <w:r>
-        <w:t xml:space="preserve"> + MD</w:t>
+        <w:t xml:space="preserve"> +</w:t>
+      </w:r>
+      <w:r>
+        <w:t xml:space="preserve"> MD</w:t>
       </w:r>
     </w:p>
     <w:p>
@@ -72,15 +80,7 @@
       </w:r>
       <w:r>
         <w:tab/>
-      </w:r>
-      <w:r>
-        <w:t>npm run test</w:t>
-      </w:r>
-      <w:r>
-        <w:t xml:space="preserve"> &amp; </w:t>
-      </w:r>
-      <w:r>
-        <w:t>npm run test:coverage</w:t>
+        <w:t>npm run test &amp; npm run test:coverage</w:t>
       </w:r>
     </w:p>
     <w:p>
@@ -225,8 +225,718 @@
       </w:r>
     </w:p>
     <w:p>
-      <w:r>
-        <w:t>Herwerkingen vallen wel mee</w:t>
+      <w:pPr>
+        <w:pStyle w:val="ListParagraph"/>
+        <w:numPr>
+          <w:ilvl w:val="0"/>
+          <w:numId w:val="2"/>
+        </w:numPr>
+      </w:pPr>
+      <w:r>
+        <w:t>no own BFF and no vault</w:t>
+      </w:r>
+    </w:p>
+    <w:p/>
+    <w:p>
+      <w:pPr>
+        <w:rPr>
+          <w:b/>
+          <w:bCs/>
+          <w:lang w:val="en-BE"/>
+        </w:rPr>
+      </w:pPr>
+      <w:r>
+        <w:rPr>
+          <w:b/>
+          <w:bCs/>
+          <w:lang w:val="en-BE"/>
+        </w:rPr>
+        <w:br w:type="page"/>
+      </w:r>
+    </w:p>
+    <w:p>
+      <w:pPr>
+        <w:rPr>
+          <w:b/>
+          <w:bCs/>
+          <w:lang w:val="en-BE"/>
+        </w:rPr>
+      </w:pPr>
+      <w:r>
+        <w:rPr>
+          <w:b/>
+          <w:bCs/>
+          <w:lang w:val="en-BE"/>
+        </w:rPr>
+        <w:lastRenderedPageBreak/>
+        <w:t>The Highest-Value Upgrade for This Project</w:t>
+      </w:r>
+    </w:p>
+    <w:p>
+      <w:pPr>
+        <w:rPr>
+          <w:lang w:val="en-BE"/>
+        </w:rPr>
+      </w:pPr>
+      <w:r>
+        <w:rPr>
+          <w:lang w:val="en-BE"/>
+        </w:rPr>
+        <w:t>The biggest security gap right now is that DATABASE_URL is a long-lived static credential. An upgrade worth considering:</w:t>
+      </w:r>
+    </w:p>
+    <w:p>
+      <w:pPr>
+        <w:numPr>
+          <w:ilvl w:val="0"/>
+          <w:numId w:val="3"/>
+        </w:numPr>
+        <w:rPr>
+          <w:lang w:val="en-BE"/>
+        </w:rPr>
+      </w:pPr>
+      <w:r>
+        <w:rPr>
+          <w:lang w:val="en-BE"/>
+        </w:rPr>
+        <w:t>Switch to Neon's IAM auth or use short-lived database credentials via a vault. Neon supports connection pooling via PgBouncer and has a concept of branch-based isolation if you ever need per-environment separation.</w:t>
+      </w:r>
+    </w:p>
+    <w:p>
+      <w:pPr>
+        <w:rPr>
+          <w:lang w:val="en-BE"/>
+        </w:rPr>
+      </w:pPr>
+      <w:r>
+        <w:rPr>
+          <w:lang w:val="en-BE"/>
+        </w:rPr>
+        <w:t>For CLERK_SECRET_KEY: Clerk supports rotating secret keys — doing that periodically and storing the current one in Doppler/Vercel Secrets is a solid practice.</w:t>
+      </w:r>
+    </w:p>
+    <w:p/>
+    <w:p>
+      <w:pPr>
+        <w:rPr>
+          <w:b/>
+          <w:bCs/>
+          <w:lang w:val="en-BE"/>
+        </w:rPr>
+      </w:pPr>
+      <w:r>
+        <w:rPr>
+          <w:b/>
+          <w:bCs/>
+          <w:lang w:val="en-BE"/>
+        </w:rPr>
+        <w:t>Why the Current Setup Is Already BFF-like</w:t>
+      </w:r>
+    </w:p>
+    <w:p>
+      <w:pPr>
+        <w:rPr>
+          <w:lang w:val="en-BE"/>
+        </w:rPr>
+      </w:pPr>
+      <w:r>
+        <w:rPr>
+          <w:lang w:val="en-BE"/>
+        </w:rPr>
+        <w:t>Next.js App Router with Server Components + Server Actions gives you the same security properties a BFF is meant to provide:</w:t>
+      </w:r>
+    </w:p>
+    <w:tbl>
+      <w:tblPr>
+        <w:tblW w:w="0" w:type="auto"/>
+        <w:tblCellSpacing w:w="15" w:type="dxa"/>
+        <w:tblBorders>
+          <w:top w:val="single" w:sz="6" w:space="0" w:color="auto"/>
+          <w:left w:val="single" w:sz="6" w:space="0" w:color="auto"/>
+          <w:bottom w:val="single" w:sz="6" w:space="0" w:color="auto"/>
+          <w:right w:val="single" w:sz="6" w:space="0" w:color="auto"/>
+        </w:tblBorders>
+        <w:tblCellMar>
+          <w:top w:w="15" w:type="dxa"/>
+          <w:left w:w="15" w:type="dxa"/>
+          <w:bottom w:w="15" w:type="dxa"/>
+          <w:right w:w="15" w:type="dxa"/>
+        </w:tblCellMar>
+        <w:tblLook w:val="04A0" w:firstRow="1" w:lastRow="0" w:firstColumn="1" w:lastColumn="0" w:noHBand="0" w:noVBand="1"/>
+      </w:tblPr>
+      <w:tblGrid>
+        <w:gridCol w:w="2966"/>
+        <w:gridCol w:w="6060"/>
+      </w:tblGrid>
+      <w:tr>
+        <w:trPr>
+          <w:tblHeader/>
+          <w:tblCellSpacing w:w="15" w:type="dxa"/>
+        </w:trPr>
+        <w:tc>
+          <w:tcPr>
+            <w:tcW w:w="0" w:type="auto"/>
+            <w:tcBorders>
+              <w:top w:val="nil"/>
+              <w:left w:val="nil"/>
+            </w:tcBorders>
+            <w:tcMar>
+              <w:top w:w="60" w:type="dxa"/>
+              <w:left w:w="90" w:type="dxa"/>
+              <w:bottom w:w="60" w:type="dxa"/>
+              <w:right w:w="90" w:type="dxa"/>
+            </w:tcMar>
+            <w:vAlign w:val="center"/>
+            <w:hideMark/>
+          </w:tcPr>
+          <w:p>
+            <w:pPr>
+              <w:rPr>
+                <w:b/>
+                <w:bCs/>
+                <w:lang w:val="en-BE"/>
+              </w:rPr>
+            </w:pPr>
+            <w:r>
+              <w:rPr>
+                <w:b/>
+                <w:bCs/>
+                <w:lang w:val="en-BE"/>
+              </w:rPr>
+              <w:t>BFF Goal</w:t>
+            </w:r>
+          </w:p>
+        </w:tc>
+        <w:tc>
+          <w:tcPr>
+            <w:tcW w:w="0" w:type="auto"/>
+            <w:tcBorders>
+              <w:top w:val="nil"/>
+              <w:left w:val="nil"/>
+              <w:right w:val="nil"/>
+            </w:tcBorders>
+            <w:tcMar>
+              <w:top w:w="60" w:type="dxa"/>
+              <w:left w:w="90" w:type="dxa"/>
+              <w:bottom w:w="60" w:type="dxa"/>
+              <w:right w:w="90" w:type="dxa"/>
+            </w:tcMar>
+            <w:vAlign w:val="center"/>
+            <w:hideMark/>
+          </w:tcPr>
+          <w:p>
+            <w:pPr>
+              <w:rPr>
+                <w:b/>
+                <w:bCs/>
+                <w:lang w:val="en-BE"/>
+              </w:rPr>
+            </w:pPr>
+            <w:r>
+              <w:rPr>
+                <w:b/>
+                <w:bCs/>
+                <w:lang w:val="en-BE"/>
+              </w:rPr>
+              <w:t>How App Router Covers It</w:t>
+            </w:r>
+          </w:p>
+        </w:tc>
+      </w:tr>
+      <w:tr>
+        <w:trPr>
+          <w:tblCellSpacing w:w="15" w:type="dxa"/>
+        </w:trPr>
+        <w:tc>
+          <w:tcPr>
+            <w:tcW w:w="0" w:type="auto"/>
+            <w:tcBorders>
+              <w:top w:val="nil"/>
+              <w:left w:val="nil"/>
+            </w:tcBorders>
+            <w:tcMar>
+              <w:top w:w="60" w:type="dxa"/>
+              <w:left w:w="90" w:type="dxa"/>
+              <w:bottom w:w="60" w:type="dxa"/>
+              <w:right w:w="90" w:type="dxa"/>
+            </w:tcMar>
+            <w:vAlign w:val="center"/>
+            <w:hideMark/>
+          </w:tcPr>
+          <w:p>
+            <w:pPr>
+              <w:rPr>
+                <w:lang w:val="en-BE"/>
+              </w:rPr>
+            </w:pPr>
+            <w:r>
+              <w:rPr>
+                <w:lang w:val="en-BE"/>
+              </w:rPr>
+              <w:t>Keep DB credentials off the client</w:t>
+            </w:r>
+          </w:p>
+        </w:tc>
+        <w:tc>
+          <w:tcPr>
+            <w:tcW w:w="0" w:type="auto"/>
+            <w:tcBorders>
+              <w:top w:val="nil"/>
+              <w:left w:val="nil"/>
+              <w:right w:val="nil"/>
+            </w:tcBorders>
+            <w:tcMar>
+              <w:top w:w="60" w:type="dxa"/>
+              <w:left w:w="90" w:type="dxa"/>
+              <w:bottom w:w="60" w:type="dxa"/>
+              <w:right w:w="90" w:type="dxa"/>
+            </w:tcMar>
+            <w:vAlign w:val="center"/>
+            <w:hideMark/>
+          </w:tcPr>
+          <w:p>
+            <w:pPr>
+              <w:rPr>
+                <w:lang w:val="en-BE"/>
+              </w:rPr>
+            </w:pPr>
+            <w:r>
+              <w:rPr>
+                <w:lang w:val="en-BE"/>
+              </w:rPr>
+              <w:t>Server Components never ship DB code/creds to the browser</w:t>
+            </w:r>
+          </w:p>
+        </w:tc>
+      </w:tr>
+      <w:tr>
+        <w:trPr>
+          <w:tblCellSpacing w:w="15" w:type="dxa"/>
+        </w:trPr>
+        <w:tc>
+          <w:tcPr>
+            <w:tcW w:w="0" w:type="auto"/>
+            <w:tcBorders>
+              <w:top w:val="nil"/>
+              <w:left w:val="nil"/>
+            </w:tcBorders>
+            <w:tcMar>
+              <w:top w:w="60" w:type="dxa"/>
+              <w:left w:w="90" w:type="dxa"/>
+              <w:bottom w:w="60" w:type="dxa"/>
+              <w:right w:w="90" w:type="dxa"/>
+            </w:tcMar>
+            <w:vAlign w:val="center"/>
+            <w:hideMark/>
+          </w:tcPr>
+          <w:p>
+            <w:pPr>
+              <w:rPr>
+                <w:lang w:val="en-BE"/>
+              </w:rPr>
+            </w:pPr>
+            <w:r>
+              <w:rPr>
+                <w:lang w:val="en-BE"/>
+              </w:rPr>
+              <w:t>Keep auth tokens off the client</w:t>
+            </w:r>
+          </w:p>
+        </w:tc>
+        <w:tc>
+          <w:tcPr>
+            <w:tcW w:w="0" w:type="auto"/>
+            <w:tcBorders>
+              <w:top w:val="nil"/>
+              <w:left w:val="nil"/>
+              <w:right w:val="nil"/>
+            </w:tcBorders>
+            <w:tcMar>
+              <w:top w:w="60" w:type="dxa"/>
+              <w:left w:w="90" w:type="dxa"/>
+              <w:bottom w:w="60" w:type="dxa"/>
+              <w:right w:w="90" w:type="dxa"/>
+            </w:tcMar>
+            <w:vAlign w:val="center"/>
+            <w:hideMark/>
+          </w:tcPr>
+          <w:p>
+            <w:pPr>
+              <w:rPr>
+                <w:lang w:val="en-BE"/>
+              </w:rPr>
+            </w:pPr>
+            <w:hyperlink r:id="rId5" w:history="1">
+              <w:r>
+                <w:rPr>
+                  <w:rStyle w:val="Hyperlink"/>
+                  <w:lang w:val="en-BE"/>
+                </w:rPr>
+                <w:t>auth()</w:t>
+              </w:r>
+            </w:hyperlink>
+            <w:r>
+              <w:rPr>
+                <w:lang w:val="en-BE"/>
+              </w:rPr>
+              <w:t> runs server-side; JWT is in an HttpOnly cookie, never JS-accessible</w:t>
+            </w:r>
+          </w:p>
+        </w:tc>
+      </w:tr>
+      <w:tr>
+        <w:trPr>
+          <w:tblCellSpacing w:w="15" w:type="dxa"/>
+        </w:trPr>
+        <w:tc>
+          <w:tcPr>
+            <w:tcW w:w="0" w:type="auto"/>
+            <w:tcBorders>
+              <w:top w:val="nil"/>
+              <w:left w:val="nil"/>
+            </w:tcBorders>
+            <w:tcMar>
+              <w:top w:w="60" w:type="dxa"/>
+              <w:left w:w="90" w:type="dxa"/>
+              <w:bottom w:w="60" w:type="dxa"/>
+              <w:right w:w="90" w:type="dxa"/>
+            </w:tcMar>
+            <w:vAlign w:val="center"/>
+            <w:hideMark/>
+          </w:tcPr>
+          <w:p>
+            <w:pPr>
+              <w:rPr>
+                <w:lang w:val="en-BE"/>
+              </w:rPr>
+            </w:pPr>
+            <w:r>
+              <w:rPr>
+                <w:lang w:val="en-BE"/>
+              </w:rPr>
+              <w:t>Prevent direct DB access from browser</w:t>
+            </w:r>
+          </w:p>
+        </w:tc>
+        <w:tc>
+          <w:tcPr>
+            <w:tcW w:w="0" w:type="auto"/>
+            <w:tcBorders>
+              <w:top w:val="nil"/>
+              <w:left w:val="nil"/>
+              <w:right w:val="nil"/>
+            </w:tcBorders>
+            <w:tcMar>
+              <w:top w:w="60" w:type="dxa"/>
+              <w:left w:w="90" w:type="dxa"/>
+              <w:bottom w:w="60" w:type="dxa"/>
+              <w:right w:w="90" w:type="dxa"/>
+            </w:tcMar>
+            <w:vAlign w:val="center"/>
+            <w:hideMark/>
+          </w:tcPr>
+          <w:p>
+            <w:pPr>
+              <w:rPr>
+                <w:lang w:val="en-BE"/>
+              </w:rPr>
+            </w:pPr>
+            <w:r>
+              <w:rPr>
+                <w:lang w:val="en-BE"/>
+              </w:rPr>
+              <w:t>Drizzle queries only ever run in server-side code</w:t>
+            </w:r>
+          </w:p>
+        </w:tc>
+      </w:tr>
+      <w:tr>
+        <w:trPr>
+          <w:tblCellSpacing w:w="15" w:type="dxa"/>
+        </w:trPr>
+        <w:tc>
+          <w:tcPr>
+            <w:tcW w:w="0" w:type="auto"/>
+            <w:tcBorders>
+              <w:top w:val="nil"/>
+              <w:left w:val="nil"/>
+              <w:bottom w:val="nil"/>
+            </w:tcBorders>
+            <w:tcMar>
+              <w:top w:w="60" w:type="dxa"/>
+              <w:left w:w="90" w:type="dxa"/>
+              <w:bottom w:w="60" w:type="dxa"/>
+              <w:right w:w="90" w:type="dxa"/>
+            </w:tcMar>
+            <w:vAlign w:val="center"/>
+            <w:hideMark/>
+          </w:tcPr>
+          <w:p>
+            <w:pPr>
+              <w:rPr>
+                <w:lang w:val="en-BE"/>
+              </w:rPr>
+            </w:pPr>
+            <w:r>
+              <w:rPr>
+                <w:lang w:val="en-BE"/>
+              </w:rPr>
+              <w:t>Single entry point for auth enforcement</w:t>
+            </w:r>
+          </w:p>
+        </w:tc>
+        <w:tc>
+          <w:tcPr>
+            <w:tcW w:w="0" w:type="auto"/>
+            <w:tcBorders>
+              <w:top w:val="nil"/>
+              <w:left w:val="nil"/>
+              <w:bottom w:val="nil"/>
+              <w:right w:val="nil"/>
+            </w:tcBorders>
+            <w:tcMar>
+              <w:top w:w="60" w:type="dxa"/>
+              <w:left w:w="90" w:type="dxa"/>
+              <w:bottom w:w="60" w:type="dxa"/>
+              <w:right w:w="90" w:type="dxa"/>
+            </w:tcMar>
+            <w:vAlign w:val="center"/>
+            <w:hideMark/>
+          </w:tcPr>
+          <w:p>
+            <w:pPr>
+              <w:rPr>
+                <w:lang w:val="en-BE"/>
+              </w:rPr>
+            </w:pPr>
+            <w:hyperlink r:id="rId6" w:history="1">
+              <w:r>
+                <w:rPr>
+                  <w:rStyle w:val="Hyperlink"/>
+                  <w:lang w:val="en-BE"/>
+                </w:rPr>
+                <w:t>clerkMiddleware()</w:t>
+              </w:r>
+            </w:hyperlink>
+            <w:r>
+              <w:rPr>
+                <w:lang w:val="en-BE"/>
+              </w:rPr>
+              <w:t> in </w:t>
+            </w:r>
+            <w:hyperlink r:id="rId7" w:history="1">
+              <w:r>
+                <w:rPr>
+                  <w:rStyle w:val="Hyperlink"/>
+                  <w:lang w:val="en-BE"/>
+                </w:rPr>
+                <w:t>proxy.ts</w:t>
+              </w:r>
+            </w:hyperlink>
+            <w:r>
+              <w:rPr>
+                <w:lang w:val="en-BE"/>
+              </w:rPr>
+              <w:t> + </w:t>
+            </w:r>
+            <w:hyperlink r:id="rId8" w:history="1">
+              <w:r>
+                <w:rPr>
+                  <w:rStyle w:val="Hyperlink"/>
+                  <w:lang w:val="en-BE"/>
+                </w:rPr>
+                <w:t>auth()</w:t>
+              </w:r>
+            </w:hyperlink>
+            <w:r>
+              <w:rPr>
+                <w:lang w:val="en-BE"/>
+              </w:rPr>
+              <w:t> checks in every </w:t>
+            </w:r>
+            <w:hyperlink r:id="rId9" w:history="1">
+              <w:r>
+                <w:rPr>
+                  <w:rStyle w:val="Hyperlink"/>
+                  <w:lang w:val="en-BE"/>
+                </w:rPr>
+                <w:t>actions.ts:38</w:t>
+              </w:r>
+            </w:hyperlink>
+          </w:p>
+        </w:tc>
+      </w:tr>
+    </w:tbl>
+    <w:p>
+      <w:pPr>
+        <w:rPr>
+          <w:lang w:val="en-BE"/>
+        </w:rPr>
+      </w:pPr>
+      <w:r>
+        <w:rPr>
+          <w:lang w:val="en-BE"/>
+        </w:rPr>
+        <w:t>A traditional SPA + separate BFF API is needed when your frontend is a pure client-side app (React/Vue/Angular) that </w:t>
+      </w:r>
+      <w:r>
+        <w:rPr>
+          <w:i/>
+          <w:iCs/>
+          <w:lang w:val="en-BE"/>
+        </w:rPr>
+        <w:t>can't</w:t>
+      </w:r>
+      <w:r>
+        <w:rPr>
+          <w:lang w:val="en-BE"/>
+        </w:rPr>
+        <w:t> run server-side logic. That's not the case here.</w:t>
+      </w:r>
+    </w:p>
+    <w:p>
+      <w:pPr>
+        <w:rPr>
+          <w:lang w:val="en-BE"/>
+        </w:rPr>
+      </w:pPr>
+      <w:r>
+        <w:rPr>
+          <w:lang w:val="en-BE"/>
+        </w:rPr>
+        <w:pict w14:anchorId="2F19277D">
+          <v:rect id="_x0000_i1025" style="width:0;height:1.5pt" o:hralign="center" o:hrstd="t" o:hr="t" fillcolor="#a0a0a0" stroked="f"/>
+        </w:pict>
+      </w:r>
+    </w:p>
+    <w:p>
+      <w:pPr>
+        <w:rPr>
+          <w:b/>
+          <w:bCs/>
+          <w:lang w:val="en-BE"/>
+        </w:rPr>
+      </w:pPr>
+      <w:r>
+        <w:rPr>
+          <w:b/>
+          <w:bCs/>
+          <w:lang w:val="en-BE"/>
+        </w:rPr>
+        <w:t>Where a Separate BFF Would Actually Add Value</w:t>
+      </w:r>
+    </w:p>
+    <w:p>
+      <w:pPr>
+        <w:rPr>
+          <w:lang w:val="en-BE"/>
+        </w:rPr>
+      </w:pPr>
+      <w:r>
+        <w:rPr>
+          <w:lang w:val="en-BE"/>
+        </w:rPr>
+        <w:t>If you added /api/* routes as a BFF layer, the real gains would be:</w:t>
+      </w:r>
+    </w:p>
+    <w:p>
+      <w:pPr>
+        <w:numPr>
+          <w:ilvl w:val="0"/>
+          <w:numId w:val="4"/>
+        </w:numPr>
+        <w:rPr>
+          <w:lang w:val="en-BE"/>
+        </w:rPr>
+      </w:pPr>
+      <w:r>
+        <w:rPr>
+          <w:b/>
+          <w:bCs/>
+          <w:lang w:val="en-BE"/>
+        </w:rPr>
+        <w:t>Rate limiting</w:t>
+      </w:r>
+      <w:r>
+        <w:rPr>
+          <w:lang w:val="en-BE"/>
+        </w:rPr>
+        <w:t> — you can attach per-endpoint rate limits (e.g., with upstash/ratelimit) more cleanly on API routes than on Server Actions</w:t>
+      </w:r>
+    </w:p>
+    <w:p>
+      <w:pPr>
+        <w:numPr>
+          <w:ilvl w:val="0"/>
+          <w:numId w:val="4"/>
+        </w:numPr>
+        <w:rPr>
+          <w:lang w:val="en-BE"/>
+        </w:rPr>
+      </w:pPr>
+      <w:r>
+        <w:rPr>
+          <w:b/>
+          <w:bCs/>
+          <w:lang w:val="en-BE"/>
+        </w:rPr>
+        <w:t>Non-browser clients</w:t>
+      </w:r>
+      <w:r>
+        <w:rPr>
+          <w:lang w:val="en-BE"/>
+        </w:rPr>
+        <w:t> — if you ever want a mobile app or external service to consume the same endpoints</w:t>
+      </w:r>
+    </w:p>
+    <w:p>
+      <w:pPr>
+        <w:numPr>
+          <w:ilvl w:val="0"/>
+          <w:numId w:val="4"/>
+        </w:numPr>
+        <w:rPr>
+          <w:lang w:val="en-BE"/>
+        </w:rPr>
+      </w:pPr>
+      <w:r>
+        <w:rPr>
+          <w:b/>
+          <w:bCs/>
+          <w:lang w:val="en-BE"/>
+        </w:rPr>
+        <w:t>Explicit CORS policy</w:t>
+      </w:r>
+      <w:r>
+        <w:rPr>
+          <w:lang w:val="en-BE"/>
+        </w:rPr>
+        <w:t> — API routes give you finer control via Response headers</w:t>
+      </w:r>
+    </w:p>
+    <w:p>
+      <w:pPr>
+        <w:numPr>
+          <w:ilvl w:val="0"/>
+          <w:numId w:val="4"/>
+        </w:numPr>
+        <w:rPr>
+          <w:lang w:val="en-BE"/>
+        </w:rPr>
+      </w:pPr>
+      <w:r>
+        <w:rPr>
+          <w:b/>
+          <w:bCs/>
+          <w:lang w:val="en-BE"/>
+        </w:rPr>
+        <w:t>Audit surface</w:t>
+      </w:r>
+      <w:r>
+        <w:rPr>
+          <w:lang w:val="en-BE"/>
+        </w:rPr>
+        <w:t> — HTTP verbs/paths are more visible in logs than Server Action POSTs to /_next/action</w:t>
       </w:r>
     </w:p>
     <w:p/>
@@ -243,6 +953,119 @@
 <file path=word/numbering.xml><?xml version="1.0" encoding="utf-8"?>
 <w:numbering xmlns:wpc="http://schemas.microsoft.com/office/word/2010/wordprocessingCanvas" xmlns:cx="http://schemas.microsoft.com/office/drawing/2014/chartex" xmlns:cx1="http://schemas.microsoft.com/office/drawing/2015/9/8/chartex" xmlns:cx2="http://schemas.microsoft.com/office/drawing/2015/10/21/chartex" xmlns:cx3="http://schemas.microsoft.com/office/drawing/2016/5/9/chartex" xmlns:cx4="http://schemas.microsoft.com/office/drawing/2016/5/10/chartex" xmlns:cx5="http://schemas.microsoft.com/office/drawing/2016/5/11/chartex" xmlns:cx6="http://schemas.microsoft.com/office/drawing/2016/5/12/chartex" xmlns:cx7="http://schemas.microsoft.com/office/drawing/2016/5/13/chartex" xmlns:cx8="http://schemas.microsoft.com/office/drawing/2016/5/14/chartex" xmlns:mc="http://schemas.openxmlformats.org/markup-compatibility/2006" xmlns:aink="http://schemas.microsoft.com/office/drawing/2016/ink" xmlns:am3d="http://schemas.microsoft.com/office/drawing/2017/model3d" xmlns:o="urn:schemas-microsoft-com:office:office" xmlns:oel="http://schemas.microsoft.com/office/2019/extlst" xmlns:r="http://schemas.openxmlformats.org/officeDocument/2006/relationships" xmlns:m="http://schemas.openxmlformats.org/officeDocument/2006/math" xmlns:v="urn:schemas-microsoft-com:vml" xmlns:wp14="http://schemas.microsoft.com/office/word/2010/wordprocessingDrawing" xmlns:wp="http://schemas.openxmlformats.org/drawingml/2006/wordprocessingDrawing" xmlns:w10="urn:schemas-microsoft-com:office:word" xmlns:w="http://schemas.openxmlformats.org/wordprocessingml/2006/main" xmlns:w14="http://schemas.microsoft.com/office/word/2010/wordml" xmlns:w15="http://schemas.microsoft.com/office/word/2012/wordml" xmlns:w16cex="http://schemas.microsoft.com/office/word/2018/wordml/cex" xmlns:w16cid="http://schemas.microsoft.com/office/word/2016/wordml/cid" xmlns:w16="http://schemas.microsoft.com/office/word/2018/wordml" xmlns:w16du="http://schemas.microsoft.com/office/word/2023/wordml/word16du" xmlns:w16sdtdh="http://schemas.microsoft.com/office/word/2020/wordml/sdtdatahash" xmlns:w16sdtfl="http://schemas.microsoft.com/office/word/2024/wordml/sdtformatlock" xmlns:w16se="http://schemas.microsoft.com/office/word/2015/wordml/symex" xmlns:wpg="http://schemas.microsoft.com/office/word/2010/wordprocessingGroup" xmlns:wpi="http://schemas.microsoft.com/office/word/2010/wordprocessingInk" xmlns:wne="http://schemas.microsoft.com/office/word/2006/wordml" xmlns:wps="http://schemas.microsoft.com/office/word/2010/wordprocessingShape" mc:Ignorable="w14 w15 w16se w16cid w16 w16cex w16sdtdh w16sdtfl w16du wp14">
   <w:abstractNum w:abstractNumId="0" w15:restartNumberingAfterBreak="0">
+    <w:nsid w:val="2C947233"/>
+    <w:multiLevelType w:val="multilevel"/>
+    <w:tmpl w:val="DF0C8062"/>
+    <w:lvl w:ilvl="0">
+      <w:start w:val="1"/>
+      <w:numFmt w:val="decimal"/>
+      <w:lvlText w:val="%1."/>
+      <w:lvlJc w:val="left"/>
+      <w:pPr>
+        <w:tabs>
+          <w:tab w:val="num" w:pos="720"/>
+        </w:tabs>
+        <w:ind w:left="720" w:hanging="360"/>
+      </w:pPr>
+    </w:lvl>
+    <w:lvl w:ilvl="1" w:tentative="1">
+      <w:start w:val="1"/>
+      <w:numFmt w:val="decimal"/>
+      <w:lvlText w:val="%2."/>
+      <w:lvlJc w:val="left"/>
+      <w:pPr>
+        <w:tabs>
+          <w:tab w:val="num" w:pos="1440"/>
+        </w:tabs>
+        <w:ind w:left="1440" w:hanging="360"/>
+      </w:pPr>
+    </w:lvl>
+    <w:lvl w:ilvl="2" w:tentative="1">
+      <w:start w:val="1"/>
+      <w:numFmt w:val="decimal"/>
+      <w:lvlText w:val="%3."/>
+      <w:lvlJc w:val="left"/>
+      <w:pPr>
+        <w:tabs>
+          <w:tab w:val="num" w:pos="2160"/>
+        </w:tabs>
+        <w:ind w:left="2160" w:hanging="360"/>
+      </w:pPr>
+    </w:lvl>
+    <w:lvl w:ilvl="3" w:tentative="1">
+      <w:start w:val="1"/>
+      <w:numFmt w:val="decimal"/>
+      <w:lvlText w:val="%4."/>
+      <w:lvlJc w:val="left"/>
+      <w:pPr>
+        <w:tabs>
+          <w:tab w:val="num" w:pos="2880"/>
+        </w:tabs>
+        <w:ind w:left="2880" w:hanging="360"/>
+      </w:pPr>
+    </w:lvl>
+    <w:lvl w:ilvl="4" w:tentative="1">
+      <w:start w:val="1"/>
+      <w:numFmt w:val="decimal"/>
+      <w:lvlText w:val="%5."/>
+      <w:lvlJc w:val="left"/>
+      <w:pPr>
+        <w:tabs>
+          <w:tab w:val="num" w:pos="3600"/>
+        </w:tabs>
+        <w:ind w:left="3600" w:hanging="360"/>
+      </w:pPr>
+    </w:lvl>
+    <w:lvl w:ilvl="5" w:tentative="1">
+      <w:start w:val="1"/>
+      <w:numFmt w:val="decimal"/>
+      <w:lvlText w:val="%6."/>
+      <w:lvlJc w:val="left"/>
+      <w:pPr>
+        <w:tabs>
+          <w:tab w:val="num" w:pos="4320"/>
+        </w:tabs>
+        <w:ind w:left="4320" w:hanging="360"/>
+      </w:pPr>
+    </w:lvl>
+    <w:lvl w:ilvl="6" w:tentative="1">
+      <w:start w:val="1"/>
+      <w:numFmt w:val="decimal"/>
+      <w:lvlText w:val="%7."/>
+      <w:lvlJc w:val="left"/>
+      <w:pPr>
+        <w:tabs>
+          <w:tab w:val="num" w:pos="5040"/>
+        </w:tabs>
+        <w:ind w:left="5040" w:hanging="360"/>
+      </w:pPr>
+    </w:lvl>
+    <w:lvl w:ilvl="7" w:tentative="1">
+      <w:start w:val="1"/>
+      <w:numFmt w:val="decimal"/>
+      <w:lvlText w:val="%8."/>
+      <w:lvlJc w:val="left"/>
+      <w:pPr>
+        <w:tabs>
+          <w:tab w:val="num" w:pos="5760"/>
+        </w:tabs>
+        <w:ind w:left="5760" w:hanging="360"/>
+      </w:pPr>
+    </w:lvl>
+    <w:lvl w:ilvl="8" w:tentative="1">
+      <w:start w:val="1"/>
+      <w:numFmt w:val="decimal"/>
+      <w:lvlText w:val="%9."/>
+      <w:lvlJc w:val="left"/>
+      <w:pPr>
+        <w:tabs>
+          <w:tab w:val="num" w:pos="6480"/>
+        </w:tabs>
+        <w:ind w:left="6480" w:hanging="360"/>
+      </w:pPr>
+    </w:lvl>
+  </w:abstractNum>
+  <w:abstractNum w:abstractNumId="1" w15:restartNumberingAfterBreak="0">
     <w:nsid w:val="45271E10"/>
     <w:multiLevelType w:val="hybridMultilevel"/>
     <w:tmpl w:val="14A8E6F8"/>
@@ -355,7 +1178,7 @@
       </w:rPr>
     </w:lvl>
   </w:abstractNum>
-  <w:abstractNum w:abstractNumId="1" w15:restartNumberingAfterBreak="0">
+  <w:abstractNum w:abstractNumId="2" w15:restartNumberingAfterBreak="0">
     <w:nsid w:val="64BD7D77"/>
     <w:multiLevelType w:val="hybridMultilevel"/>
     <w:tmpl w:val="C7E2C5E8"/>
@@ -467,10 +1290,165 @@
       </w:rPr>
     </w:lvl>
   </w:abstractNum>
+  <w:abstractNum w:abstractNumId="3" w15:restartNumberingAfterBreak="0">
+    <w:nsid w:val="7CF50A5F"/>
+    <w:multiLevelType w:val="multilevel"/>
+    <w:tmpl w:val="FB08293C"/>
+    <w:lvl w:ilvl="0">
+      <w:start w:val="1"/>
+      <w:numFmt w:val="bullet"/>
+      <w:lvlText w:val=""/>
+      <w:lvlJc w:val="left"/>
+      <w:pPr>
+        <w:tabs>
+          <w:tab w:val="num" w:pos="720"/>
+        </w:tabs>
+        <w:ind w:left="720" w:hanging="360"/>
+      </w:pPr>
+      <w:rPr>
+        <w:rFonts w:ascii="Symbol" w:hAnsi="Symbol" w:hint="default"/>
+        <w:sz w:val="20"/>
+      </w:rPr>
+    </w:lvl>
+    <w:lvl w:ilvl="1" w:tentative="1">
+      <w:start w:val="1"/>
+      <w:numFmt w:val="bullet"/>
+      <w:lvlText w:val="o"/>
+      <w:lvlJc w:val="left"/>
+      <w:pPr>
+        <w:tabs>
+          <w:tab w:val="num" w:pos="1440"/>
+        </w:tabs>
+        <w:ind w:left="1440" w:hanging="360"/>
+      </w:pPr>
+      <w:rPr>
+        <w:rFonts w:ascii="Courier New" w:hAnsi="Courier New" w:hint="default"/>
+        <w:sz w:val="20"/>
+      </w:rPr>
+    </w:lvl>
+    <w:lvl w:ilvl="2" w:tentative="1">
+      <w:start w:val="1"/>
+      <w:numFmt w:val="bullet"/>
+      <w:lvlText w:val=""/>
+      <w:lvlJc w:val="left"/>
+      <w:pPr>
+        <w:tabs>
+          <w:tab w:val="num" w:pos="2160"/>
+        </w:tabs>
+        <w:ind w:left="2160" w:hanging="360"/>
+      </w:pPr>
+      <w:rPr>
+        <w:rFonts w:ascii="Wingdings" w:hAnsi="Wingdings" w:hint="default"/>
+        <w:sz w:val="20"/>
+      </w:rPr>
+    </w:lvl>
+    <w:lvl w:ilvl="3" w:tentative="1">
+      <w:start w:val="1"/>
+      <w:numFmt w:val="bullet"/>
+      <w:lvlText w:val=""/>
+      <w:lvlJc w:val="left"/>
+      <w:pPr>
+        <w:tabs>
+          <w:tab w:val="num" w:pos="2880"/>
+        </w:tabs>
+        <w:ind w:left="2880" w:hanging="360"/>
+      </w:pPr>
+      <w:rPr>
+        <w:rFonts w:ascii="Wingdings" w:hAnsi="Wingdings" w:hint="default"/>
+        <w:sz w:val="20"/>
+      </w:rPr>
+    </w:lvl>
+    <w:lvl w:ilvl="4" w:tentative="1">
+      <w:start w:val="1"/>
+      <w:numFmt w:val="bullet"/>
+      <w:lvlText w:val=""/>
+      <w:lvlJc w:val="left"/>
+      <w:pPr>
+        <w:tabs>
+          <w:tab w:val="num" w:pos="3600"/>
+        </w:tabs>
+        <w:ind w:left="3600" w:hanging="360"/>
+      </w:pPr>
+      <w:rPr>
+        <w:rFonts w:ascii="Wingdings" w:hAnsi="Wingdings" w:hint="default"/>
+        <w:sz w:val="20"/>
+      </w:rPr>
+    </w:lvl>
+    <w:lvl w:ilvl="5" w:tentative="1">
+      <w:start w:val="1"/>
+      <w:numFmt w:val="bullet"/>
+      <w:lvlText w:val=""/>
+      <w:lvlJc w:val="left"/>
+      <w:pPr>
+        <w:tabs>
+          <w:tab w:val="num" w:pos="4320"/>
+        </w:tabs>
+        <w:ind w:left="4320" w:hanging="360"/>
+      </w:pPr>
+      <w:rPr>
+        <w:rFonts w:ascii="Wingdings" w:hAnsi="Wingdings" w:hint="default"/>
+        <w:sz w:val="20"/>
+      </w:rPr>
+    </w:lvl>
+    <w:lvl w:ilvl="6" w:tentative="1">
+      <w:start w:val="1"/>
+      <w:numFmt w:val="bullet"/>
+      <w:lvlText w:val=""/>
+      <w:lvlJc w:val="left"/>
+      <w:pPr>
+        <w:tabs>
+          <w:tab w:val="num" w:pos="5040"/>
+        </w:tabs>
+        <w:ind w:left="5040" w:hanging="360"/>
+      </w:pPr>
+      <w:rPr>
+        <w:rFonts w:ascii="Wingdings" w:hAnsi="Wingdings" w:hint="default"/>
+        <w:sz w:val="20"/>
+      </w:rPr>
+    </w:lvl>
+    <w:lvl w:ilvl="7" w:tentative="1">
+      <w:start w:val="1"/>
+      <w:numFmt w:val="bullet"/>
+      <w:lvlText w:val=""/>
+      <w:lvlJc w:val="left"/>
+      <w:pPr>
+        <w:tabs>
+          <w:tab w:val="num" w:pos="5760"/>
+        </w:tabs>
+        <w:ind w:left="5760" w:hanging="360"/>
+      </w:pPr>
+      <w:rPr>
+        <w:rFonts w:ascii="Wingdings" w:hAnsi="Wingdings" w:hint="default"/>
+        <w:sz w:val="20"/>
+      </w:rPr>
+    </w:lvl>
+    <w:lvl w:ilvl="8" w:tentative="1">
+      <w:start w:val="1"/>
+      <w:numFmt w:val="bullet"/>
+      <w:lvlText w:val=""/>
+      <w:lvlJc w:val="left"/>
+      <w:pPr>
+        <w:tabs>
+          <w:tab w:val="num" w:pos="6480"/>
+        </w:tabs>
+        <w:ind w:left="6480" w:hanging="360"/>
+      </w:pPr>
+      <w:rPr>
+        <w:rFonts w:ascii="Wingdings" w:hAnsi="Wingdings" w:hint="default"/>
+        <w:sz w:val="20"/>
+      </w:rPr>
+    </w:lvl>
+  </w:abstractNum>
   <w:num w:numId="1" w16cid:durableId="1913006946">
+    <w:abstractNumId w:val="2"/>
+  </w:num>
+  <w:num w:numId="2" w16cid:durableId="1189173842">
     <w:abstractNumId w:val="1"/>
   </w:num>
-  <w:num w:numId="2" w16cid:durableId="1189173842">
+  <w:num w:numId="3" w16cid:durableId="619842135">
+    <w:abstractNumId w:val="3"/>
+  </w:num>
+  <w:num w:numId="4" w16cid:durableId="1207377325">
     <w:abstractNumId w:val="0"/>
   </w:num>
 </w:numbering>
@@ -1423,6 +2401,29 @@
       <w:spacing w:val="5"/>
     </w:rPr>
   </w:style>
+  <w:style w:type="character" w:styleId="Hyperlink">
+    <w:name w:val="Hyperlink"/>
+    <w:basedOn w:val="DefaultParagraphFont"/>
+    <w:uiPriority w:val="99"/>
+    <w:unhideWhenUsed/>
+    <w:rsid w:val="00A6055E"/>
+    <w:rPr>
+      <w:color w:val="467886" w:themeColor="hyperlink"/>
+      <w:u w:val="single"/>
+    </w:rPr>
+  </w:style>
+  <w:style w:type="character" w:styleId="UnresolvedMention">
+    <w:name w:val="Unresolved Mention"/>
+    <w:basedOn w:val="DefaultParagraphFont"/>
+    <w:uiPriority w:val="99"/>
+    <w:semiHidden/>
+    <w:unhideWhenUsed/>
+    <w:rsid w:val="00A6055E"/>
+    <w:rPr>
+      <w:color w:val="605E5C"/>
+      <w:shd w:val="clear" w:color="auto" w:fill="E1DFDD"/>
+    </w:rPr>
+  </w:style>
 </w:styles>
 </file>
 

</xml_diff>